<commit_message>
added: spezifizierten Aufbau, Titelbild, aktualisierte Forschungsfrage
</commit_message>
<xml_diff>
--- a/Arbeit/GDD/Mission_Statement.docx
+++ b/Arbeit/GDD/Mission_Statement.docx
@@ -246,7 +246,97 @@
           <w:sz w:val="22"/>
           <w:szCs w:val="22"/>
         </w:rPr>
-        <w:t xml:space="preserve">Das Serious Game „Deep Space Debugger“ soll es ermöglichen, OOP-Prinzipien durch interaktive Problemlösung in einer spielerischen Umgebung erfahrbar zu machen, ohne dass klassische Programmierkenntnisse erforderlich sind. </w:t>
+        <w:t>Das Serious Game „Deep Space Debugger“ soll OOP-Prinzipien durch interaktive Problemlösung</w:t>
+      </w:r>
+      <w:r>
+        <w:rPr>
+          <w:rFonts w:ascii="Verdana" w:eastAsia="Verdana" w:hAnsi="Verdana" w:cs="Verdana"/>
+          <w:color w:val="000000"/>
+          <w:sz w:val="22"/>
+          <w:szCs w:val="22"/>
+        </w:rPr>
+        <w:t>en</w:t>
+      </w:r>
+      <w:r>
+        <w:rPr>
+          <w:rFonts w:ascii="Verdana" w:eastAsia="Verdana" w:hAnsi="Verdana" w:cs="Verdana"/>
+          <w:color w:val="000000"/>
+          <w:sz w:val="22"/>
+          <w:szCs w:val="22"/>
+        </w:rPr>
+        <w:t xml:space="preserve"> in</w:t>
+      </w:r>
+      <w:r>
+        <w:rPr>
+          <w:rFonts w:ascii="Verdana" w:eastAsia="Verdana" w:hAnsi="Verdana" w:cs="Verdana"/>
+          <w:color w:val="000000"/>
+          <w:sz w:val="22"/>
+          <w:szCs w:val="22"/>
+        </w:rPr>
+        <w:t xml:space="preserve">nerhalb </w:t>
+      </w:r>
+      <w:r>
+        <w:rPr>
+          <w:rFonts w:ascii="Verdana" w:eastAsia="Verdana" w:hAnsi="Verdana" w:cs="Verdana"/>
+          <w:color w:val="000000"/>
+          <w:sz w:val="22"/>
+          <w:szCs w:val="22"/>
+        </w:rPr>
+        <w:t>einer spielerischen Umgebung erfahrbar</w:t>
+      </w:r>
+      <w:r>
+        <w:rPr>
+          <w:rFonts w:ascii="Verdana" w:eastAsia="Verdana" w:hAnsi="Verdana" w:cs="Verdana"/>
+          <w:color w:val="000000"/>
+          <w:sz w:val="22"/>
+          <w:szCs w:val="22"/>
+        </w:rPr>
+        <w:t xml:space="preserve"> </w:t>
+      </w:r>
+      <w:r>
+        <w:rPr>
+          <w:rFonts w:ascii="Verdana" w:eastAsia="Verdana" w:hAnsi="Verdana" w:cs="Verdana"/>
+          <w:color w:val="000000"/>
+          <w:sz w:val="22"/>
+          <w:szCs w:val="22"/>
+        </w:rPr>
+        <w:t xml:space="preserve">machen, ohne </w:t>
+      </w:r>
+      <w:r>
+        <w:rPr>
+          <w:rFonts w:ascii="Verdana" w:eastAsia="Verdana" w:hAnsi="Verdana" w:cs="Verdana"/>
+          <w:color w:val="000000"/>
+          <w:sz w:val="22"/>
+          <w:szCs w:val="22"/>
+        </w:rPr>
+        <w:t>dabei</w:t>
+      </w:r>
+      <w:r>
+        <w:rPr>
+          <w:rFonts w:ascii="Verdana" w:eastAsia="Verdana" w:hAnsi="Verdana" w:cs="Verdana"/>
+          <w:color w:val="000000"/>
+          <w:sz w:val="22"/>
+          <w:szCs w:val="22"/>
+        </w:rPr>
+        <w:t xml:space="preserve"> klassische Programmierkenntnisse </w:t>
+      </w:r>
+      <w:r>
+        <w:rPr>
+          <w:rFonts w:ascii="Verdana" w:eastAsia="Verdana" w:hAnsi="Verdana" w:cs="Verdana"/>
+          <w:color w:val="000000"/>
+          <w:sz w:val="22"/>
+          <w:szCs w:val="22"/>
+        </w:rPr>
+        <w:t>vorauszusetzen</w:t>
+      </w:r>
+      <w:r>
+        <w:rPr>
+          <w:rFonts w:ascii="Verdana" w:eastAsia="Verdana" w:hAnsi="Verdana" w:cs="Verdana"/>
+          <w:color w:val="000000"/>
+          <w:sz w:val="22"/>
+          <w:szCs w:val="22"/>
+        </w:rPr>
+        <w:t xml:space="preserve">. </w:t>
       </w:r>
     </w:p>
     <w:p>
@@ -327,7 +417,14 @@
           <w:rFonts w:ascii="Verdana" w:eastAsia="Verdana" w:hAnsi="Verdana" w:cs="Verdana"/>
           <w:color w:val="000000"/>
         </w:rPr>
-        <w:t xml:space="preserve">Inwiefern können grundlegende Konzepte des objektorientierten Paradigmas durch ein 2D Serious Game effektiv vermittelt und verständlich gemacht werden? </w:t>
+        <w:t>Wie effektiv kann ein 2D-Serious-Game grundlegende Konzepte des objektorientierten Paradigmas vermitteln?</w:t>
+      </w:r>
+      <w:r>
+        <w:rPr>
+          <w:rFonts w:ascii="Verdana" w:eastAsia="Verdana" w:hAnsi="Verdana" w:cs="Verdana"/>
+          <w:color w:val="000000"/>
+        </w:rPr>
+        <w:t xml:space="preserve"> </w:t>
       </w:r>
     </w:p>
     <w:tbl>

</xml_diff>